<commit_message>
v435.0.0: Argumentation und Testakten vertieft
Juristische Argumentationsketten, fachbezogene Prompt-Routen und neun Aktenbestände wurden substanziell überarbeitet. Rechtsprechungszuordnungen, Dokumentqualität, Binärpakete, Navigation und Marketplace-Metadaten sind konsolidiert und vollständig geprüft.
</commit_message>
<xml_diff>
--- a/testakten/handelsvertreterrecht-provisionsausgleich-nordstern-medtech/01-mandatsnotiz-und-arbeitsauftrag.docx
+++ b/testakten/handelsvertreterrecht-provisionsausgleich-nordstern-medtech/01-mandatsnotiz-und-arbeitsauftrag.docx
@@ -2,49 +2,1684 @@
 <file path=word/document.xml><?xml version="1.0" encoding="utf-8"?>
 <w:document xmlns:wpc="http://schemas.microsoft.com/office/word/2010/wordprocessingCanvas" xmlns:mo="http://schemas.microsoft.com/office/mac/office/2008/main" xmlns:mc="http://schemas.openxmlformats.org/markup-compatibility/2006" xmlns:mv="urn:schemas-microsoft-com:mac:vml" xmlns:o="urn:schemas-microsoft-com:office:office" xmlns:r="http://schemas.openxmlformats.org/officeDocument/2006/relationships" xmlns:m="http://schemas.openxmlformats.org/officeDocument/2006/math" xmlns:v="urn:schemas-microsoft-com:vml" xmlns:wp14="http://schemas.microsoft.com/office/word/2010/wordprocessingDrawing" xmlns:wp="http://schemas.openxmlformats.org/drawingml/2006/wordprocessingDrawing" xmlns:w10="urn:schemas-microsoft-com:office:word" xmlns:w="http://schemas.openxmlformats.org/wordprocessingml/2006/main" xmlns:w14="http://schemas.microsoft.com/office/word/2010/wordml" xmlns:wpg="http://schemas.microsoft.com/office/word/2010/wordprocessingGroup" xmlns:wpi="http://schemas.microsoft.com/office/word/2010/wordprocessingInk" xmlns:wne="http://schemas.microsoft.com/office/word/2006/wordml" xmlns:wps="http://schemas.microsoft.com/office/word/2010/wordprocessingShape" mc:Ignorable="w14 wp14">
   <w:body>
+    <w:tbl>
+      <w:tblPr>
+        <w:tblW w:type="auto" w:w="0"/>
+        <w:tblLayout w:type="fixed"/>
+        <w:tblLook w:firstColumn="1" w:firstRow="1" w:lastColumn="0" w:lastRow="0" w:noHBand="0" w:noVBand="1" w:val="04A0"/>
+      </w:tblPr>
+      <w:tblGrid>
+        <w:gridCol w:w="6520"/>
+        <w:gridCol w:w="2948"/>
+      </w:tblGrid>
+      <w:tr>
+        <w:tc>
+          <w:tcPr>
+            <w:tcW w:type="dxa" w:w="4790"/>
+            <w:tcMar>
+              <w:top w:w="0" w:type="dxa"/>
+              <w:start w:w="0" w:type="dxa"/>
+              <w:bottom w:w="80" w:type="dxa"/>
+              <w:end w:w="80" w:type="dxa"/>
+            </w:tcMar>
+          </w:tcPr>
+          <w:p>
+            <w:pPr>
+              <w:spacing w:after="20"/>
+            </w:pPr>
+            <w:r>
+              <w:rPr>
+                <w:b/>
+                <w:color w:val="17324D"/>
+                <w:sz w:val="24"/>
+              </w:rPr>
+              <w:t>RHEINBLICK RECHTSANWÄLTE PartG mbB</w:t>
+            </w:r>
+          </w:p>
+          <w:p>
+            <w:pPr>
+              <w:spacing w:after="0"/>
+            </w:pPr>
+            <w:r>
+              <w:rPr>
+                <w:color w:val="59636B"/>
+                <w:sz w:val="16"/>
+              </w:rPr>
+              <w:t>Hohenzollernring 57 · 50672 Köln · Telefon 0221 580 44 20 · Fax 0221 580 44 29</w:t>
+            </w:r>
+          </w:p>
+          <w:p>
+            <w:pPr>
+              <w:spacing w:after="0"/>
+            </w:pPr>
+            <w:r>
+              <w:rPr>
+                <w:color w:val="59636B"/>
+                <w:sz w:val="16"/>
+              </w:rPr>
+              <w:t>kanzlei@rheinblick-recht.de · Partnerschaftsregister AG Essen PR 4812 · Fremdgeldkonto DE56 3704 0044 0712 9080 00</w:t>
+            </w:r>
+          </w:p>
+        </w:tc>
+        <w:tc>
+          <w:tcPr>
+            <w:tcW w:type="dxa" w:w="4790"/>
+            <w:tcMar>
+              <w:top w:w="0" w:type="dxa"/>
+              <w:start w:w="80" w:type="dxa"/>
+              <w:bottom w:w="80" w:type="dxa"/>
+              <w:end w:w="0" w:type="dxa"/>
+            </w:tcMar>
+          </w:tcPr>
+          <w:p>
+            <w:pPr>
+              <w:jc w:val="right"/>
+            </w:pPr>
+            <w:r>
+              <w:rPr>
+                <w:b/>
+                <w:color w:val="2E668B"/>
+                <w:sz w:val="18"/>
+              </w:rPr>
+              <w:t>MANDATSAUFNAHME</w:t>
+            </w:r>
+          </w:p>
+        </w:tc>
+      </w:tr>
+    </w:tbl>
+    <w:p>
+      <w:pPr>
+        <w:spacing w:after="160"/>
+        <w:pBdr>
+          <w:bottom w:val="single" w:sz="10" w:space="1" w:color="2E668B"/>
+        </w:pBdr>
+      </w:pPr>
+    </w:p>
+    <w:p>
+      <w:pPr>
+        <w:pStyle w:val="Title"/>
+      </w:pPr>
+      <w:r>
+        <w:t>Mandatsaufnahme und Arbeitsauftrag</w:t>
+      </w:r>
+    </w:p>
+    <w:p>
+      <w:pPr>
+        <w:spacing w:after="180"/>
+      </w:pPr>
+      <w:r>
+        <w:rPr>
+          <w:b/>
+          <w:color w:val="2E668B"/>
+        </w:rPr>
+        <w:t>Altfeld Vertrieb GmbH ./. Nordstern MedTech GmbH</w:t>
+      </w:r>
+    </w:p>
+    <w:tbl>
+      <w:tblPr>
+        <w:tblW w:type="auto" w:w="0"/>
+        <w:tblLayout w:type="fixed"/>
+        <w:tblLook w:firstColumn="1" w:firstRow="1" w:lastColumn="0" w:lastRow="0" w:noHBand="0" w:noVBand="1" w:val="04A0"/>
+      </w:tblPr>
+      <w:tblGrid>
+        <w:gridCol w:w="2268"/>
+        <w:gridCol w:w="7200"/>
+      </w:tblGrid>
+      <w:tr>
+        <w:tc>
+          <w:tcPr>
+            <w:tcW w:type="dxa" w:w="2268"/>
+            <w:shd w:fill="EAF1F5"/>
+            <w:tcMar>
+              <w:top w:w="90" w:type="dxa"/>
+              <w:start w:w="90" w:type="dxa"/>
+              <w:bottom w:w="90" w:type="dxa"/>
+              <w:end w:w="90" w:type="dxa"/>
+            </w:tcMar>
+            <w:vAlign w:val="center"/>
+          </w:tcPr>
+          <w:p>
+            <w:pPr>
+              <w:spacing w:after="0"/>
+            </w:pPr>
+            <w:r>
+              <w:rPr>
+                <w:b/>
+                <w:sz w:val="18"/>
+              </w:rPr>
+              <w:t>Aufgenommen</w:t>
+            </w:r>
+          </w:p>
+        </w:tc>
+        <w:tc>
+          <w:tcPr>
+            <w:tcW w:type="dxa" w:w="7200"/>
+            <w:tcMar>
+              <w:top w:w="90" w:type="dxa"/>
+              <w:start w:w="90" w:type="dxa"/>
+              <w:bottom w:w="90" w:type="dxa"/>
+              <w:end w:w="90" w:type="dxa"/>
+            </w:tcMar>
+            <w:vAlign w:val="center"/>
+          </w:tcPr>
+          <w:p>
+            <w:pPr>
+              <w:spacing w:after="0"/>
+            </w:pPr>
+            <w:r>
+              <w:rPr>
+                <w:sz w:val="18"/>
+              </w:rPr>
+              <w:t>2. Juni 2026, 11:47 Uhr, Telefonat mit Thorsten Altfeld</w:t>
+            </w:r>
+          </w:p>
+        </w:tc>
+      </w:tr>
+      <w:tr>
+        <w:tc>
+          <w:tcPr>
+            <w:tcW w:type="dxa" w:w="2268"/>
+            <w:shd w:fill="EAF1F5"/>
+            <w:tcMar>
+              <w:top w:w="90" w:type="dxa"/>
+              <w:start w:w="90" w:type="dxa"/>
+              <w:bottom w:w="90" w:type="dxa"/>
+              <w:end w:w="90" w:type="dxa"/>
+            </w:tcMar>
+            <w:vAlign w:val="center"/>
+          </w:tcPr>
+          <w:p>
+            <w:pPr>
+              <w:spacing w:after="0"/>
+            </w:pPr>
+            <w:r>
+              <w:rPr>
+                <w:b/>
+                <w:sz w:val="18"/>
+              </w:rPr>
+              <w:t>Mandantin</w:t>
+            </w:r>
+          </w:p>
+        </w:tc>
+        <w:tc>
+          <w:tcPr>
+            <w:tcW w:type="dxa" w:w="7200"/>
+            <w:tcMar>
+              <w:top w:w="90" w:type="dxa"/>
+              <w:start w:w="90" w:type="dxa"/>
+              <w:bottom w:w="90" w:type="dxa"/>
+              <w:end w:w="90" w:type="dxa"/>
+            </w:tcMar>
+            <w:vAlign w:val="center"/>
+          </w:tcPr>
+          <w:p>
+            <w:pPr>
+              <w:spacing w:after="0"/>
+            </w:pPr>
+            <w:r>
+              <w:rPr>
+                <w:sz w:val="18"/>
+              </w:rPr>
+              <w:t>Altfeld Vertrieb GmbH, Friedrich-Ebert-Straße 94, 34119 Kassel</w:t>
+            </w:r>
+          </w:p>
+        </w:tc>
+      </w:tr>
+      <w:tr>
+        <w:tc>
+          <w:tcPr>
+            <w:tcW w:type="dxa" w:w="2268"/>
+            <w:shd w:fill="EAF1F5"/>
+            <w:tcMar>
+              <w:top w:w="90" w:type="dxa"/>
+              <w:start w:w="90" w:type="dxa"/>
+              <w:bottom w:w="90" w:type="dxa"/>
+              <w:end w:w="90" w:type="dxa"/>
+            </w:tcMar>
+            <w:vAlign w:val="center"/>
+          </w:tcPr>
+          <w:p>
+            <w:pPr>
+              <w:spacing w:after="0"/>
+            </w:pPr>
+            <w:r>
+              <w:rPr>
+                <w:b/>
+                <w:sz w:val="18"/>
+              </w:rPr>
+              <w:t>Gegenseite</w:t>
+            </w:r>
+          </w:p>
+        </w:tc>
+        <w:tc>
+          <w:tcPr>
+            <w:tcW w:type="dxa" w:w="7200"/>
+            <w:tcMar>
+              <w:top w:w="90" w:type="dxa"/>
+              <w:start w:w="90" w:type="dxa"/>
+              <w:bottom w:w="90" w:type="dxa"/>
+              <w:end w:w="90" w:type="dxa"/>
+            </w:tcMar>
+            <w:vAlign w:val="center"/>
+          </w:tcPr>
+          <w:p>
+            <w:pPr>
+              <w:spacing w:after="0"/>
+            </w:pPr>
+            <w:r>
+              <w:rPr>
+                <w:sz w:val="18"/>
+              </w:rPr>
+              <w:t>Nordstern MedTech GmbH, Ruhrallee 188, 45136 Essen</w:t>
+            </w:r>
+          </w:p>
+        </w:tc>
+      </w:tr>
+      <w:tr>
+        <w:tc>
+          <w:tcPr>
+            <w:tcW w:type="dxa" w:w="2268"/>
+            <w:shd w:fill="EAF1F5"/>
+            <w:tcMar>
+              <w:top w:w="90" w:type="dxa"/>
+              <w:start w:w="90" w:type="dxa"/>
+              <w:bottom w:w="90" w:type="dxa"/>
+              <w:end w:w="90" w:type="dxa"/>
+            </w:tcMar>
+            <w:vAlign w:val="center"/>
+          </w:tcPr>
+          <w:p>
+            <w:pPr>
+              <w:spacing w:after="0"/>
+            </w:pPr>
+            <w:r>
+              <w:rPr>
+                <w:b/>
+                <w:sz w:val="18"/>
+              </w:rPr>
+              <w:t>Sachbearbeitung</w:t>
+            </w:r>
+          </w:p>
+        </w:tc>
+        <w:tc>
+          <w:tcPr>
+            <w:tcW w:type="dxa" w:w="7200"/>
+            <w:tcMar>
+              <w:top w:w="90" w:type="dxa"/>
+              <w:start w:w="90" w:type="dxa"/>
+              <w:bottom w:w="90" w:type="dxa"/>
+              <w:end w:w="90" w:type="dxa"/>
+            </w:tcMar>
+            <w:vAlign w:val="center"/>
+          </w:tcPr>
+          <w:p>
+            <w:pPr>
+              <w:spacing w:after="0"/>
+            </w:pPr>
+            <w:r>
+              <w:rPr>
+                <w:sz w:val="18"/>
+              </w:rPr>
+              <w:t>Rechtsanwalt Dr. Frank Rohrhuber; Stefanie Pollok, Rechtsanwältin</w:t>
+            </w:r>
+          </w:p>
+        </w:tc>
+      </w:tr>
+      <w:tr>
+        <w:tc>
+          <w:tcPr>
+            <w:tcW w:type="dxa" w:w="2268"/>
+            <w:shd w:fill="EAF1F5"/>
+            <w:tcMar>
+              <w:top w:w="90" w:type="dxa"/>
+              <w:start w:w="90" w:type="dxa"/>
+              <w:bottom w:w="90" w:type="dxa"/>
+              <w:end w:w="90" w:type="dxa"/>
+            </w:tcMar>
+            <w:vAlign w:val="center"/>
+          </w:tcPr>
+          <w:p>
+            <w:pPr>
+              <w:spacing w:after="0"/>
+            </w:pPr>
+            <w:r>
+              <w:rPr>
+                <w:b/>
+                <w:sz w:val="18"/>
+              </w:rPr>
+              <w:t>Fristnotiz</w:t>
+            </w:r>
+          </w:p>
+        </w:tc>
+        <w:tc>
+          <w:tcPr>
+            <w:tcW w:type="dxa" w:w="7200"/>
+            <w:tcMar>
+              <w:top w:w="90" w:type="dxa"/>
+              <w:start w:w="90" w:type="dxa"/>
+              <w:bottom w:w="90" w:type="dxa"/>
+              <w:end w:w="90" w:type="dxa"/>
+            </w:tcMar>
+            <w:vAlign w:val="center"/>
+          </w:tcPr>
+          <w:p>
+            <w:pPr>
+              <w:spacing w:after="0"/>
+            </w:pPr>
+            <w:r>
+              <w:rPr>
+                <w:sz w:val="18"/>
+              </w:rPr>
+              <w:t>Vertragsende laut Kündigung: 31. Dezember 2026; weitere Fristen gesondert prüfen</w:t>
+            </w:r>
+          </w:p>
+        </w:tc>
+      </w:tr>
+    </w:tbl>
+    <w:p>
+      <w:pPr>
+        <w:spacing w:after="20"/>
+      </w:pPr>
+    </w:p>
     <w:p>
       <w:pPr>
         <w:pStyle w:val="Heading1"/>
       </w:pPr>
       <w:r>
-        <w:rPr>
-          <w:rFonts w:ascii="Times New Roman" w:hAnsi="Times New Roman"/>
-        </w:rPr>
-        <w:t>Mandatsnotiz</w:t>
+        <w:t>1. Anlass des Mandats</w:t>
       </w:r>
     </w:p>
     <w:p>
       <w:pPr>
-        <w:jc w:val="left"/>
+        <w:widowControl/>
       </w:pPr>
       <w:r>
-        <w:t>Nordstern MedTech GmbH kündigt einer langjährigen Handelsvertreteragentur nach Online-Vertriebsumstellung; streitig sind Status, Bezirksprovision, Buchauszug, Stornoreserve und Ausgleich § 89b HGB.</w:t>
+        <w:t>Geschäftsführer Thorsten Altfeld meldete sich während einer Autofahrt aus dem Raum Gießen. Er übersandte noch im Gespräch die Kündigungs-E-Mail der Nordstern MedTech GmbH vom 22. Mai 2026 und bat um Prüfung der offenen Provisionsabrechnungen, der Stornoreserve, des verlangten Buchauszugs sowie der nachvertraglichen Wettbewerbsabrede.</w:t>
       </w:r>
     </w:p>
     <w:p>
       <w:pPr>
-        <w:jc w:val="left"/>
+        <w:widowControl/>
       </w:pPr>
       <w:r>
-        <w:t>Beteiligte: Geschäftsleitung, Rechtsabteilung, operative Fachabteilungen, externe IT/Compliance-Berater und mehrere Personen mit eigenen Interessen. Die Akte ist bewusst unaufgeräumt: manche Unterlagen widersprechen sich, Zahlenstände weichen ab und einzelne Dokumente wirken bereits überholt.</w:t>
+        <w:t>Die Geschäftsbeziehung besteht nach Angaben des Mandanten seit dem schriftlichen Vertrag vom 3. Juni 2018. Vertragsgebiet sind Nordrhein-Westfalen und Hessen. Die Mandantin beschäftigt zwei Außendienstmitarbeiter und eine Teilzeitkraft im Innendienst; ein wesentlicher Teil des Jahresumsatzes entfällt auf Nordstern-Produkte.</w:t>
       </w:r>
     </w:p>
     <w:p>
       <w:pPr>
-        <w:jc w:val="left"/>
+        <w:pStyle w:val="Heading1"/>
       </w:pPr>
       <w:r>
-        <w:t>Arbeitsziel heute: zuerst sortieren, dann keine vorschnelle Rechtsmeinung ausgeben. Jede harte Aussage soll auf ein konkretes Aktenstück oder eine frei prüfbare Quelle zurückgeführt werden.</w:t>
+        <w:t>2. Tatsachenstand aus dem Erstkontakt</w:t>
+      </w:r>
+    </w:p>
+    <w:tbl>
+      <w:tblPr>
+        <w:tblStyle w:val="TableGrid"/>
+        <w:tblW w:type="auto" w:w="0"/>
+        <w:tblLayout w:type="fixed"/>
+        <w:tblLook w:firstColumn="1" w:firstRow="1" w:lastColumn="0" w:lastRow="0" w:noHBand="0" w:noVBand="1" w:val="04A0"/>
+      </w:tblPr>
+      <w:tblGrid>
+        <w:gridCol w:w="1757"/>
+        <w:gridCol w:w="3458"/>
+        <w:gridCol w:w="2324"/>
+        <w:gridCol w:w="1928"/>
+      </w:tblGrid>
+      <w:tr>
+        <w:tc>
+          <w:tcPr>
+            <w:tcW w:type="dxa" w:w="2395"/>
+            <w:shd w:fill="17324D"/>
+            <w:tcMar>
+              <w:top w:w="90" w:type="dxa"/>
+              <w:start w:w="90" w:type="dxa"/>
+              <w:bottom w:w="90" w:type="dxa"/>
+              <w:end w:w="90" w:type="dxa"/>
+            </w:tcMar>
+          </w:tcPr>
+          <w:p>
+            <w:r>
+              <w:rPr>
+                <w:b/>
+                <w:color w:val="FFFFFF"/>
+                <w:sz w:val="17"/>
+              </w:rPr>
+              <w:t>Thema</w:t>
+            </w:r>
+          </w:p>
+        </w:tc>
+        <w:tc>
+          <w:tcPr>
+            <w:tcW w:type="dxa" w:w="2395"/>
+            <w:shd w:fill="17324D"/>
+            <w:tcMar>
+              <w:top w:w="90" w:type="dxa"/>
+              <w:start w:w="90" w:type="dxa"/>
+              <w:bottom w:w="90" w:type="dxa"/>
+              <w:end w:w="90" w:type="dxa"/>
+            </w:tcMar>
+          </w:tcPr>
+          <w:p>
+            <w:r>
+              <w:rPr>
+                <w:b/>
+                <w:color w:val="FFFFFF"/>
+                <w:sz w:val="17"/>
+              </w:rPr>
+              <w:t>Angabe des Mandanten</w:t>
+            </w:r>
+          </w:p>
+        </w:tc>
+        <w:tc>
+          <w:tcPr>
+            <w:tcW w:type="dxa" w:w="2395"/>
+            <w:shd w:fill="17324D"/>
+            <w:tcMar>
+              <w:top w:w="90" w:type="dxa"/>
+              <w:start w:w="90" w:type="dxa"/>
+              <w:bottom w:w="90" w:type="dxa"/>
+              <w:end w:w="90" w:type="dxa"/>
+            </w:tcMar>
+          </w:tcPr>
+          <w:p>
+            <w:r>
+              <w:rPr>
+                <w:b/>
+                <w:color w:val="FFFFFF"/>
+                <w:sz w:val="17"/>
+              </w:rPr>
+              <w:t>Vorhandener Beleg</w:t>
+            </w:r>
+          </w:p>
+        </w:tc>
+        <w:tc>
+          <w:tcPr>
+            <w:tcW w:type="dxa" w:w="2395"/>
+            <w:shd w:fill="17324D"/>
+            <w:tcMar>
+              <w:top w:w="90" w:type="dxa"/>
+              <w:start w:w="90" w:type="dxa"/>
+              <w:bottom w:w="90" w:type="dxa"/>
+              <w:end w:w="90" w:type="dxa"/>
+            </w:tcMar>
+          </w:tcPr>
+          <w:p>
+            <w:r>
+              <w:rPr>
+                <w:b/>
+                <w:color w:val="FFFFFF"/>
+                <w:sz w:val="17"/>
+              </w:rPr>
+              <w:t>Noch offen</w:t>
+            </w:r>
+          </w:p>
+        </w:tc>
+      </w:tr>
+      <w:tr>
+        <w:tc>
+          <w:tcPr>
+            <w:tcW w:type="dxa" w:w="1757"/>
+            <w:tcMar>
+              <w:top w:w="90" w:type="dxa"/>
+              <w:start w:w="90" w:type="dxa"/>
+              <w:bottom w:w="90" w:type="dxa"/>
+              <w:end w:w="90" w:type="dxa"/>
+            </w:tcMar>
+            <w:vAlign w:val="top"/>
+          </w:tcPr>
+          <w:p>
+            <w:pPr>
+              <w:spacing w:after="0"/>
+            </w:pPr>
+            <w:r>
+              <w:rPr>
+                <w:sz w:val="16"/>
+              </w:rPr>
+              <w:t>Kündigung</w:t>
+            </w:r>
+          </w:p>
+        </w:tc>
+        <w:tc>
+          <w:tcPr>
+            <w:tcW w:type="dxa" w:w="3458"/>
+            <w:tcMar>
+              <w:top w:w="90" w:type="dxa"/>
+              <w:start w:w="90" w:type="dxa"/>
+              <w:bottom w:w="90" w:type="dxa"/>
+              <w:end w:w="90" w:type="dxa"/>
+            </w:tcMar>
+            <w:vAlign w:val="top"/>
+          </w:tcPr>
+          <w:p>
+            <w:pPr>
+              <w:spacing w:after="0"/>
+            </w:pPr>
+            <w:r>
+              <w:rPr>
+                <w:sz w:val="16"/>
+              </w:rPr>
+              <w:t>Ordentliche Beendigung zum 31. Dezember 2026 wegen zentralem Online- und Key-Account-Vertrieb</w:t>
+            </w:r>
+          </w:p>
+        </w:tc>
+        <w:tc>
+          <w:tcPr>
+            <w:tcW w:type="dxa" w:w="2324"/>
+            <w:tcMar>
+              <w:top w:w="90" w:type="dxa"/>
+              <w:start w:w="90" w:type="dxa"/>
+              <w:bottom w:w="90" w:type="dxa"/>
+              <w:end w:w="90" w:type="dxa"/>
+            </w:tcMar>
+            <w:vAlign w:val="top"/>
+          </w:tcPr>
+          <w:p>
+            <w:pPr>
+              <w:spacing w:after="0"/>
+            </w:pPr>
+            <w:r>
+              <w:rPr>
+                <w:sz w:val="16"/>
+              </w:rPr>
+              <w:t>E-Mail vom 22. Mai 2026</w:t>
+            </w:r>
+          </w:p>
+        </w:tc>
+        <w:tc>
+          <w:tcPr>
+            <w:tcW w:type="dxa" w:w="1928"/>
+            <w:tcMar>
+              <w:top w:w="90" w:type="dxa"/>
+              <w:start w:w="90" w:type="dxa"/>
+              <w:bottom w:w="90" w:type="dxa"/>
+              <w:end w:w="90" w:type="dxa"/>
+            </w:tcMar>
+            <w:vAlign w:val="top"/>
+          </w:tcPr>
+          <w:p>
+            <w:pPr>
+              <w:spacing w:after="0"/>
+            </w:pPr>
+            <w:r>
+              <w:rPr>
+                <w:sz w:val="16"/>
+              </w:rPr>
+              <w:t>Originalvertrag, Anlagen und Zugangsnachweis</w:t>
+            </w:r>
+          </w:p>
+        </w:tc>
+      </w:tr>
+      <w:tr>
+        <w:tc>
+          <w:tcPr>
+            <w:tcW w:type="dxa" w:w="1757"/>
+            <w:tcMar>
+              <w:top w:w="90" w:type="dxa"/>
+              <w:start w:w="90" w:type="dxa"/>
+              <w:bottom w:w="90" w:type="dxa"/>
+              <w:end w:w="90" w:type="dxa"/>
+            </w:tcMar>
+            <w:vAlign w:val="top"/>
+            <w:shd w:fill="F5F7F8"/>
+          </w:tcPr>
+          <w:p>
+            <w:pPr>
+              <w:spacing w:after="0"/>
+            </w:pPr>
+            <w:r>
+              <w:rPr>
+                <w:sz w:val="16"/>
+              </w:rPr>
+              <w:t>Bezirksumsätze</w:t>
+            </w:r>
+          </w:p>
+        </w:tc>
+        <w:tc>
+          <w:tcPr>
+            <w:tcW w:type="dxa" w:w="3458"/>
+            <w:tcMar>
+              <w:top w:w="90" w:type="dxa"/>
+              <w:start w:w="90" w:type="dxa"/>
+              <w:bottom w:w="90" w:type="dxa"/>
+              <w:end w:w="90" w:type="dxa"/>
+            </w:tcMar>
+            <w:vAlign w:val="top"/>
+            <w:shd w:fill="F5F7F8"/>
+          </w:tcPr>
+          <w:p>
+            <w:pPr>
+              <w:spacing w:after="0"/>
+            </w:pPr>
+            <w:r>
+              <w:rPr>
+                <w:sz w:val="16"/>
+              </w:rPr>
+              <w:t>Online-Bestellungen aus NRW und Hessen seien seit Herbst 2024 nicht vollständig verprovisioniert</w:t>
+            </w:r>
+          </w:p>
+        </w:tc>
+        <w:tc>
+          <w:tcPr>
+            <w:tcW w:type="dxa" w:w="2324"/>
+            <w:tcMar>
+              <w:top w:w="90" w:type="dxa"/>
+              <w:start w:w="90" w:type="dxa"/>
+              <w:bottom w:w="90" w:type="dxa"/>
+              <w:end w:w="90" w:type="dxa"/>
+            </w:tcMar>
+            <w:vAlign w:val="top"/>
+            <w:shd w:fill="F5F7F8"/>
+          </w:tcPr>
+          <w:p>
+            <w:pPr>
+              <w:spacing w:after="0"/>
+            </w:pPr>
+            <w:r>
+              <w:rPr>
+                <w:sz w:val="16"/>
+              </w:rPr>
+              <w:t>Provisionsdatei mit drei Beispielvorgängen</w:t>
+            </w:r>
+          </w:p>
+        </w:tc>
+        <w:tc>
+          <w:tcPr>
+            <w:tcW w:type="dxa" w:w="1928"/>
+            <w:tcMar>
+              <w:top w:w="90" w:type="dxa"/>
+              <w:start w:w="90" w:type="dxa"/>
+              <w:bottom w:w="90" w:type="dxa"/>
+              <w:end w:w="90" w:type="dxa"/>
+            </w:tcMar>
+            <w:vAlign w:val="top"/>
+            <w:shd w:fill="F5F7F8"/>
+          </w:tcPr>
+          <w:p>
+            <w:pPr>
+              <w:spacing w:after="0"/>
+            </w:pPr>
+            <w:r>
+              <w:rPr>
+                <w:sz w:val="16"/>
+              </w:rPr>
+              <w:t>Vollständiger Buchauszug, Postleitzahl-Export, Rahmenvertragsabrufe</w:t>
+            </w:r>
+          </w:p>
+        </w:tc>
+      </w:tr>
+      <w:tr>
+        <w:tc>
+          <w:tcPr>
+            <w:tcW w:type="dxa" w:w="1757"/>
+            <w:tcMar>
+              <w:top w:w="90" w:type="dxa"/>
+              <w:start w:w="90" w:type="dxa"/>
+              <w:bottom w:w="90" w:type="dxa"/>
+              <w:end w:w="90" w:type="dxa"/>
+            </w:tcMar>
+            <w:vAlign w:val="top"/>
+          </w:tcPr>
+          <w:p>
+            <w:pPr>
+              <w:spacing w:after="0"/>
+            </w:pPr>
+            <w:r>
+              <w:rPr>
+                <w:sz w:val="16"/>
+              </w:rPr>
+              <w:t>Neukunden</w:t>
+            </w:r>
+          </w:p>
+        </w:tc>
+        <w:tc>
+          <w:tcPr>
+            <w:tcW w:type="dxa" w:w="3458"/>
+            <w:tcMar>
+              <w:top w:w="90" w:type="dxa"/>
+              <w:start w:w="90" w:type="dxa"/>
+              <w:bottom w:w="90" w:type="dxa"/>
+              <w:end w:w="90" w:type="dxa"/>
+            </w:tcMar>
+            <w:vAlign w:val="top"/>
+          </w:tcPr>
+          <w:p>
+            <w:pPr>
+              <w:spacing w:after="0"/>
+            </w:pPr>
+            <w:r>
+              <w:rPr>
+                <w:sz w:val="16"/>
+              </w:rPr>
+              <w:t>Klinikum Westbogen, Praxisnetz Lahntal und weitere Einrichtungen seien durch eigene Besuche aufgebaut worden</w:t>
+            </w:r>
+          </w:p>
+        </w:tc>
+        <w:tc>
+          <w:tcPr>
+            <w:tcW w:type="dxa" w:w="2324"/>
+            <w:tcMar>
+              <w:top w:w="90" w:type="dxa"/>
+              <w:start w:w="90" w:type="dxa"/>
+              <w:bottom w:w="90" w:type="dxa"/>
+              <w:end w:w="90" w:type="dxa"/>
+            </w:tcMar>
+            <w:vAlign w:val="top"/>
+          </w:tcPr>
+          <w:p>
+            <w:pPr>
+              <w:spacing w:after="0"/>
+            </w:pPr>
+            <w:r>
+              <w:rPr>
+                <w:sz w:val="16"/>
+              </w:rPr>
+              <w:t>Kundenliste und CRM-Screenshot</w:t>
+            </w:r>
+          </w:p>
+        </w:tc>
+        <w:tc>
+          <w:tcPr>
+            <w:tcW w:type="dxa" w:w="1928"/>
+            <w:tcMar>
+              <w:top w:w="90" w:type="dxa"/>
+              <w:start w:w="90" w:type="dxa"/>
+              <w:bottom w:w="90" w:type="dxa"/>
+              <w:end w:w="90" w:type="dxa"/>
+            </w:tcMar>
+            <w:vAlign w:val="top"/>
+          </w:tcPr>
+          <w:p>
+            <w:pPr>
+              <w:spacing w:after="0"/>
+            </w:pPr>
+            <w:r>
+              <w:rPr>
+                <w:sz w:val="16"/>
+              </w:rPr>
+              <w:t>Erstkontakte, Folgeaufträge, Ansprechpartner und Zuordnung zentraler Accounts</w:t>
+            </w:r>
+          </w:p>
+        </w:tc>
+      </w:tr>
+      <w:tr>
+        <w:tc>
+          <w:tcPr>
+            <w:tcW w:type="dxa" w:w="1757"/>
+            <w:tcMar>
+              <w:top w:w="90" w:type="dxa"/>
+              <w:start w:w="90" w:type="dxa"/>
+              <w:bottom w:w="90" w:type="dxa"/>
+              <w:end w:w="90" w:type="dxa"/>
+            </w:tcMar>
+            <w:vAlign w:val="top"/>
+            <w:shd w:fill="F5F7F8"/>
+          </w:tcPr>
+          <w:p>
+            <w:pPr>
+              <w:spacing w:after="0"/>
+            </w:pPr>
+            <w:r>
+              <w:rPr>
+                <w:sz w:val="16"/>
+              </w:rPr>
+              <w:t>Stornoreserve</w:t>
+            </w:r>
+          </w:p>
+        </w:tc>
+        <w:tc>
+          <w:tcPr>
+            <w:tcW w:type="dxa" w:w="3458"/>
+            <w:tcMar>
+              <w:top w:w="90" w:type="dxa"/>
+              <w:start w:w="90" w:type="dxa"/>
+              <w:bottom w:w="90" w:type="dxa"/>
+              <w:end w:w="90" w:type="dxa"/>
+            </w:tcMar>
+            <w:vAlign w:val="top"/>
+            <w:shd w:fill="F5F7F8"/>
+          </w:tcPr>
+          <w:p>
+            <w:pPr>
+              <w:spacing w:after="0"/>
+            </w:pPr>
+            <w:r>
+              <w:rPr>
+                <w:sz w:val="16"/>
+              </w:rPr>
+              <w:t>Zwanzig Prozent würden pauschal bis zu 18 Monate einbehalten</w:t>
+            </w:r>
+          </w:p>
+        </w:tc>
+        <w:tc>
+          <w:tcPr>
+            <w:tcW w:type="dxa" w:w="2324"/>
+            <w:tcMar>
+              <w:top w:w="90" w:type="dxa"/>
+              <w:start w:w="90" w:type="dxa"/>
+              <w:bottom w:w="90" w:type="dxa"/>
+              <w:end w:w="90" w:type="dxa"/>
+            </w:tcMar>
+            <w:vAlign w:val="top"/>
+            <w:shd w:fill="F5F7F8"/>
+          </w:tcPr>
+          <w:p>
+            <w:pPr>
+              <w:spacing w:after="0"/>
+            </w:pPr>
+            <w:r>
+              <w:rPr>
+                <w:sz w:val="16"/>
+              </w:rPr>
+              <w:t>Abrechnung PO-1920</w:t>
+            </w:r>
+          </w:p>
+        </w:tc>
+        <w:tc>
+          <w:tcPr>
+            <w:tcW w:type="dxa" w:w="1928"/>
+            <w:tcMar>
+              <w:top w:w="90" w:type="dxa"/>
+              <w:start w:w="90" w:type="dxa"/>
+              <w:bottom w:w="90" w:type="dxa"/>
+              <w:end w:w="90" w:type="dxa"/>
+            </w:tcMar>
+            <w:vAlign w:val="top"/>
+            <w:shd w:fill="F5F7F8"/>
+          </w:tcPr>
+          <w:p>
+            <w:pPr>
+              <w:spacing w:after="0"/>
+            </w:pPr>
+            <w:r>
+              <w:rPr>
+                <w:sz w:val="16"/>
+              </w:rPr>
+              <w:t>Einzelfallgründe, Ausführungsstand, Freigaben und Rückzahlungen</w:t>
+            </w:r>
+          </w:p>
+        </w:tc>
+      </w:tr>
+      <w:tr>
+        <w:tc>
+          <w:tcPr>
+            <w:tcW w:type="dxa" w:w="1757"/>
+            <w:tcMar>
+              <w:top w:w="90" w:type="dxa"/>
+              <w:start w:w="90" w:type="dxa"/>
+              <w:bottom w:w="90" w:type="dxa"/>
+              <w:end w:w="90" w:type="dxa"/>
+            </w:tcMar>
+            <w:vAlign w:val="top"/>
+          </w:tcPr>
+          <w:p>
+            <w:pPr>
+              <w:spacing w:after="0"/>
+            </w:pPr>
+            <w:r>
+              <w:rPr>
+                <w:sz w:val="16"/>
+              </w:rPr>
+              <w:t>Wettbewerbsabrede</w:t>
+            </w:r>
+          </w:p>
+        </w:tc>
+        <w:tc>
+          <w:tcPr>
+            <w:tcW w:type="dxa" w:w="3458"/>
+            <w:tcMar>
+              <w:top w:w="90" w:type="dxa"/>
+              <w:start w:w="90" w:type="dxa"/>
+              <w:bottom w:w="90" w:type="dxa"/>
+              <w:end w:w="90" w:type="dxa"/>
+            </w:tcMar>
+            <w:vAlign w:val="top"/>
+          </w:tcPr>
+          <w:p>
+            <w:pPr>
+              <w:spacing w:after="0"/>
+            </w:pPr>
+            <w:r>
+              <w:rPr>
+                <w:sz w:val="16"/>
+              </w:rPr>
+              <w:t>24 Monate, bundesweiter Produktbezug, Karenzregel unklar</w:t>
+            </w:r>
+          </w:p>
+        </w:tc>
+        <w:tc>
+          <w:tcPr>
+            <w:tcW w:type="dxa" w:w="2324"/>
+            <w:tcMar>
+              <w:top w:w="90" w:type="dxa"/>
+              <w:start w:w="90" w:type="dxa"/>
+              <w:bottom w:w="90" w:type="dxa"/>
+              <w:end w:w="90" w:type="dxa"/>
+            </w:tcMar>
+            <w:vAlign w:val="top"/>
+          </w:tcPr>
+          <w:p>
+            <w:pPr>
+              <w:spacing w:after="0"/>
+            </w:pPr>
+            <w:r>
+              <w:rPr>
+                <w:sz w:val="16"/>
+              </w:rPr>
+              <w:t>Vertragsauszug</w:t>
+            </w:r>
+          </w:p>
+        </w:tc>
+        <w:tc>
+          <w:tcPr>
+            <w:tcW w:type="dxa" w:w="1928"/>
+            <w:tcMar>
+              <w:top w:w="90" w:type="dxa"/>
+              <w:start w:w="90" w:type="dxa"/>
+              <w:bottom w:w="90" w:type="dxa"/>
+              <w:end w:w="90" w:type="dxa"/>
+            </w:tcMar>
+            <w:vAlign w:val="top"/>
+          </w:tcPr>
+          <w:p>
+            <w:pPr>
+              <w:spacing w:after="0"/>
+            </w:pPr>
+            <w:r>
+              <w:rPr>
+                <w:sz w:val="16"/>
+              </w:rPr>
+              <w:t>Vollständige Klausel, Aushändigung, etwaige Verzichtserklärung</w:t>
+            </w:r>
+          </w:p>
+        </w:tc>
+      </w:tr>
+    </w:tbl>
+    <w:p>
+      <w:pPr>
+        <w:spacing w:after="20"/>
+      </w:pPr>
+    </w:p>
+    <w:p>
+      <w:pPr>
+        <w:pStyle w:val="Heading1"/>
+      </w:pPr>
+      <w:r>
+        <w:t>3. Übergebene Unterlagen</w:t>
+      </w:r>
+    </w:p>
+    <w:p>
+      <w:pPr>
+        <w:widowControl/>
+      </w:pPr>
+      <w:r>
+        <w:t>Per E-Mail gingen die Kündigung, das anwaltliche Buchauszugsverlangen vom 25. Mai 2026, ein Vertragsauszug, eine Excel-Datei mit drei Provisionsvorgängen und ein CRM-Screenshot ein. Der Mandant kündigte einen Aktenordner mit dem Originalvertrag, Provisionsabrechnungen 2023 bis 2025 und Reisekalendern für den 5. Juni 2026 an.</w:t>
+      </w:r>
+    </w:p>
+    <w:p>
+      <w:pPr>
+        <w:widowControl/>
+      </w:pPr>
+      <w:r>
+        <w:t>Der Mandant wies darauf hin, dass einzelne Aufzeichnungen unter dem früheren Firmenkonto „Altfeld Medizinhandel“ geführt werden. Vor Verwendung ist daher zu klären, welche Gesellschaft jeweils Vertragspartner und Rechnungsempfänger war.</w:t>
+      </w:r>
+    </w:p>
+    <w:p>
+      <w:pPr>
+        <w:pStyle w:val="Heading1"/>
+      </w:pPr>
+      <w:r>
+        <w:t>4. Arbeitsauftrag bis zur Besprechung</w:t>
+      </w:r>
+    </w:p>
+    <w:tbl>
+      <w:tblPr>
+        <w:tblStyle w:val="TableGrid"/>
+        <w:tblW w:type="auto" w:w="0"/>
+        <w:tblLayout w:type="fixed"/>
+        <w:tblLook w:firstColumn="1" w:firstRow="1" w:lastColumn="0" w:lastRow="0" w:noHBand="0" w:noVBand="1" w:val="04A0"/>
+      </w:tblPr>
+      <w:tblGrid>
+        <w:gridCol w:w="3061"/>
+        <w:gridCol w:w="1814"/>
+        <w:gridCol w:w="1871"/>
+        <w:gridCol w:w="2721"/>
+      </w:tblGrid>
+      <w:tr>
+        <w:tc>
+          <w:tcPr>
+            <w:tcW w:type="dxa" w:w="2395"/>
+            <w:shd w:fill="17324D"/>
+            <w:tcMar>
+              <w:top w:w="90" w:type="dxa"/>
+              <w:start w:w="90" w:type="dxa"/>
+              <w:bottom w:w="90" w:type="dxa"/>
+              <w:end w:w="90" w:type="dxa"/>
+            </w:tcMar>
+          </w:tcPr>
+          <w:p>
+            <w:r>
+              <w:rPr>
+                <w:b/>
+                <w:color w:val="FFFFFF"/>
+                <w:sz w:val="17"/>
+              </w:rPr>
+              <w:t>Arbeitsschritt</w:t>
+            </w:r>
+          </w:p>
+        </w:tc>
+        <w:tc>
+          <w:tcPr>
+            <w:tcW w:type="dxa" w:w="2395"/>
+            <w:shd w:fill="17324D"/>
+            <w:tcMar>
+              <w:top w:w="90" w:type="dxa"/>
+              <w:start w:w="90" w:type="dxa"/>
+              <w:bottom w:w="90" w:type="dxa"/>
+              <w:end w:w="90" w:type="dxa"/>
+            </w:tcMar>
+          </w:tcPr>
+          <w:p>
+            <w:r>
+              <w:rPr>
+                <w:b/>
+                <w:color w:val="FFFFFF"/>
+                <w:sz w:val="17"/>
+              </w:rPr>
+              <w:t>Verantwortlich</w:t>
+            </w:r>
+          </w:p>
+        </w:tc>
+        <w:tc>
+          <w:tcPr>
+            <w:tcW w:type="dxa" w:w="2395"/>
+            <w:shd w:fill="17324D"/>
+            <w:tcMar>
+              <w:top w:w="90" w:type="dxa"/>
+              <w:start w:w="90" w:type="dxa"/>
+              <w:bottom w:w="90" w:type="dxa"/>
+              <w:end w:w="90" w:type="dxa"/>
+            </w:tcMar>
+          </w:tcPr>
+          <w:p>
+            <w:r>
+              <w:rPr>
+                <w:b/>
+                <w:color w:val="FFFFFF"/>
+                <w:sz w:val="17"/>
+              </w:rPr>
+              <w:t>Termin</w:t>
+            </w:r>
+          </w:p>
+        </w:tc>
+        <w:tc>
+          <w:tcPr>
+            <w:tcW w:type="dxa" w:w="2395"/>
+            <w:shd w:fill="17324D"/>
+            <w:tcMar>
+              <w:top w:w="90" w:type="dxa"/>
+              <w:start w:w="90" w:type="dxa"/>
+              <w:bottom w:w="90" w:type="dxa"/>
+              <w:end w:w="90" w:type="dxa"/>
+            </w:tcMar>
+          </w:tcPr>
+          <w:p>
+            <w:r>
+              <w:rPr>
+                <w:b/>
+                <w:color w:val="FFFFFF"/>
+                <w:sz w:val="17"/>
+              </w:rPr>
+              <w:t>Erwartetes Ergebnis</w:t>
+            </w:r>
+          </w:p>
+        </w:tc>
+      </w:tr>
+      <w:tr>
+        <w:tc>
+          <w:tcPr>
+            <w:tcW w:type="dxa" w:w="3061"/>
+            <w:tcMar>
+              <w:top w:w="90" w:type="dxa"/>
+              <w:start w:w="90" w:type="dxa"/>
+              <w:bottom w:w="90" w:type="dxa"/>
+              <w:end w:w="90" w:type="dxa"/>
+            </w:tcMar>
+            <w:vAlign w:val="top"/>
+          </w:tcPr>
+          <w:p>
+            <w:pPr>
+              <w:spacing w:after="0"/>
+            </w:pPr>
+            <w:r>
+              <w:rPr>
+                <w:sz w:val="16"/>
+              </w:rPr>
+              <w:t>Vertrag, Nachträge und Anlagen vollständig erfassen</w:t>
+            </w:r>
+          </w:p>
+        </w:tc>
+        <w:tc>
+          <w:tcPr>
+            <w:tcW w:type="dxa" w:w="1814"/>
+            <w:tcMar>
+              <w:top w:w="90" w:type="dxa"/>
+              <w:start w:w="90" w:type="dxa"/>
+              <w:bottom w:w="90" w:type="dxa"/>
+              <w:end w:w="90" w:type="dxa"/>
+            </w:tcMar>
+            <w:vAlign w:val="top"/>
+          </w:tcPr>
+          <w:p>
+            <w:pPr>
+              <w:spacing w:after="0"/>
+            </w:pPr>
+            <w:r>
+              <w:rPr>
+                <w:sz w:val="16"/>
+              </w:rPr>
+              <w:t>Sekretariat / Mandantin</w:t>
+            </w:r>
+          </w:p>
+        </w:tc>
+        <w:tc>
+          <w:tcPr>
+            <w:tcW w:type="dxa" w:w="1871"/>
+            <w:tcMar>
+              <w:top w:w="90" w:type="dxa"/>
+              <w:start w:w="90" w:type="dxa"/>
+              <w:bottom w:w="90" w:type="dxa"/>
+              <w:end w:w="90" w:type="dxa"/>
+            </w:tcMar>
+            <w:vAlign w:val="top"/>
+          </w:tcPr>
+          <w:p>
+            <w:pPr>
+              <w:spacing w:after="0"/>
+            </w:pPr>
+            <w:r>
+              <w:rPr>
+                <w:sz w:val="16"/>
+              </w:rPr>
+              <w:t>5. Juni 2026, 09:30 Uhr</w:t>
+            </w:r>
+          </w:p>
+        </w:tc>
+        <w:tc>
+          <w:tcPr>
+            <w:tcW w:type="dxa" w:w="2721"/>
+            <w:tcMar>
+              <w:top w:w="90" w:type="dxa"/>
+              <w:start w:w="90" w:type="dxa"/>
+              <w:bottom w:w="90" w:type="dxa"/>
+              <w:end w:w="90" w:type="dxa"/>
+            </w:tcMar>
+            <w:vAlign w:val="top"/>
+          </w:tcPr>
+          <w:p>
+            <w:pPr>
+              <w:spacing w:after="0"/>
+            </w:pPr>
+            <w:r>
+              <w:rPr>
+                <w:sz w:val="16"/>
+              </w:rPr>
+              <w:t>Dokumentenregister mit fehlenden Seiten</w:t>
+            </w:r>
+          </w:p>
+        </w:tc>
+      </w:tr>
+      <w:tr>
+        <w:tc>
+          <w:tcPr>
+            <w:tcW w:type="dxa" w:w="3061"/>
+            <w:tcMar>
+              <w:top w:w="90" w:type="dxa"/>
+              <w:start w:w="90" w:type="dxa"/>
+              <w:bottom w:w="90" w:type="dxa"/>
+              <w:end w:w="90" w:type="dxa"/>
+            </w:tcMar>
+            <w:vAlign w:val="top"/>
+            <w:shd w:fill="F5F7F8"/>
+          </w:tcPr>
+          <w:p>
+            <w:pPr>
+              <w:spacing w:after="0"/>
+            </w:pPr>
+            <w:r>
+              <w:rPr>
+                <w:sz w:val="16"/>
+              </w:rPr>
+              <w:t>Provisionsdaten und Kundenhistorie abgleichen</w:t>
+            </w:r>
+          </w:p>
+        </w:tc>
+        <w:tc>
+          <w:tcPr>
+            <w:tcW w:type="dxa" w:w="1814"/>
+            <w:tcMar>
+              <w:top w:w="90" w:type="dxa"/>
+              <w:start w:w="90" w:type="dxa"/>
+              <w:bottom w:w="90" w:type="dxa"/>
+              <w:end w:w="90" w:type="dxa"/>
+            </w:tcMar>
+            <w:vAlign w:val="top"/>
+            <w:shd w:fill="F5F7F8"/>
+          </w:tcPr>
+          <w:p>
+            <w:pPr>
+              <w:spacing w:after="0"/>
+            </w:pPr>
+            <w:r>
+              <w:rPr>
+                <w:sz w:val="16"/>
+              </w:rPr>
+              <w:t>Stefanie Pollok</w:t>
+            </w:r>
+          </w:p>
+        </w:tc>
+        <w:tc>
+          <w:tcPr>
+            <w:tcW w:type="dxa" w:w="1871"/>
+            <w:tcMar>
+              <w:top w:w="90" w:type="dxa"/>
+              <w:start w:w="90" w:type="dxa"/>
+              <w:bottom w:w="90" w:type="dxa"/>
+              <w:end w:w="90" w:type="dxa"/>
+            </w:tcMar>
+            <w:vAlign w:val="top"/>
+            <w:shd w:fill="F5F7F8"/>
+          </w:tcPr>
+          <w:p>
+            <w:pPr>
+              <w:spacing w:after="0"/>
+            </w:pPr>
+            <w:r>
+              <w:rPr>
+                <w:sz w:val="16"/>
+              </w:rPr>
+              <w:t>8. Juni 2026</w:t>
+            </w:r>
+          </w:p>
+        </w:tc>
+        <w:tc>
+          <w:tcPr>
+            <w:tcW w:type="dxa" w:w="2721"/>
+            <w:tcMar>
+              <w:top w:w="90" w:type="dxa"/>
+              <w:start w:w="90" w:type="dxa"/>
+              <w:bottom w:w="90" w:type="dxa"/>
+              <w:end w:w="90" w:type="dxa"/>
+            </w:tcMar>
+            <w:vAlign w:val="top"/>
+            <w:shd w:fill="F5F7F8"/>
+          </w:tcPr>
+          <w:p>
+            <w:pPr>
+              <w:spacing w:after="0"/>
+            </w:pPr>
+            <w:r>
+              <w:rPr>
+                <w:sz w:val="16"/>
+              </w:rPr>
+              <w:t>Tabelle je Geschäft mit Quelle und Abweichung</w:t>
+            </w:r>
+          </w:p>
+        </w:tc>
+      </w:tr>
+      <w:tr>
+        <w:tc>
+          <w:tcPr>
+            <w:tcW w:type="dxa" w:w="3061"/>
+            <w:tcMar>
+              <w:top w:w="90" w:type="dxa"/>
+              <w:start w:w="90" w:type="dxa"/>
+              <w:bottom w:w="90" w:type="dxa"/>
+              <w:end w:w="90" w:type="dxa"/>
+            </w:tcMar>
+            <w:vAlign w:val="top"/>
+          </w:tcPr>
+          <w:p>
+            <w:pPr>
+              <w:spacing w:after="0"/>
+            </w:pPr>
+            <w:r>
+              <w:rPr>
+                <w:sz w:val="16"/>
+              </w:rPr>
+              <w:t>Buchauszugsverlangen und Zustellnachweis prüfen</w:t>
+            </w:r>
+          </w:p>
+        </w:tc>
+        <w:tc>
+          <w:tcPr>
+            <w:tcW w:type="dxa" w:w="1814"/>
+            <w:tcMar>
+              <w:top w:w="90" w:type="dxa"/>
+              <w:start w:w="90" w:type="dxa"/>
+              <w:bottom w:w="90" w:type="dxa"/>
+              <w:end w:w="90" w:type="dxa"/>
+            </w:tcMar>
+            <w:vAlign w:val="top"/>
+          </w:tcPr>
+          <w:p>
+            <w:pPr>
+              <w:spacing w:after="0"/>
+            </w:pPr>
+            <w:r>
+              <w:rPr>
+                <w:sz w:val="16"/>
+              </w:rPr>
+              <w:t>Dr. Frank Rohrhuber</w:t>
+            </w:r>
+          </w:p>
+        </w:tc>
+        <w:tc>
+          <w:tcPr>
+            <w:tcW w:type="dxa" w:w="1871"/>
+            <w:tcMar>
+              <w:top w:w="90" w:type="dxa"/>
+              <w:start w:w="90" w:type="dxa"/>
+              <w:bottom w:w="90" w:type="dxa"/>
+              <w:end w:w="90" w:type="dxa"/>
+            </w:tcMar>
+            <w:vAlign w:val="top"/>
+          </w:tcPr>
+          <w:p>
+            <w:pPr>
+              <w:spacing w:after="0"/>
+            </w:pPr>
+            <w:r>
+              <w:rPr>
+                <w:sz w:val="16"/>
+              </w:rPr>
+              <w:t>8. Juni 2026</w:t>
+            </w:r>
+          </w:p>
+        </w:tc>
+        <w:tc>
+          <w:tcPr>
+            <w:tcW w:type="dxa" w:w="2721"/>
+            <w:tcMar>
+              <w:top w:w="90" w:type="dxa"/>
+              <w:start w:w="90" w:type="dxa"/>
+              <w:bottom w:w="90" w:type="dxa"/>
+              <w:end w:w="90" w:type="dxa"/>
+            </w:tcMar>
+            <w:vAlign w:val="top"/>
+          </w:tcPr>
+          <w:p>
+            <w:pPr>
+              <w:spacing w:after="0"/>
+            </w:pPr>
+            <w:r>
+              <w:rPr>
+                <w:sz w:val="16"/>
+              </w:rPr>
+              <w:t>Versandfertiger Nachforderungsentwurf</w:t>
+            </w:r>
+          </w:p>
+        </w:tc>
+      </w:tr>
+      <w:tr>
+        <w:tc>
+          <w:tcPr>
+            <w:tcW w:type="dxa" w:w="3061"/>
+            <w:tcMar>
+              <w:top w:w="90" w:type="dxa"/>
+              <w:start w:w="90" w:type="dxa"/>
+              <w:bottom w:w="90" w:type="dxa"/>
+              <w:end w:w="90" w:type="dxa"/>
+            </w:tcMar>
+            <w:vAlign w:val="top"/>
+            <w:shd w:fill="F5F7F8"/>
+          </w:tcPr>
+          <w:p>
+            <w:pPr>
+              <w:spacing w:after="0"/>
+            </w:pPr>
+            <w:r>
+              <w:rPr>
+                <w:sz w:val="16"/>
+              </w:rPr>
+              <w:t>Zeugen und Datenzugriffe sichern</w:t>
+            </w:r>
+          </w:p>
+        </w:tc>
+        <w:tc>
+          <w:tcPr>
+            <w:tcW w:type="dxa" w:w="1814"/>
+            <w:tcMar>
+              <w:top w:w="90" w:type="dxa"/>
+              <w:start w:w="90" w:type="dxa"/>
+              <w:bottom w:w="90" w:type="dxa"/>
+              <w:end w:w="90" w:type="dxa"/>
+            </w:tcMar>
+            <w:vAlign w:val="top"/>
+            <w:shd w:fill="F5F7F8"/>
+          </w:tcPr>
+          <w:p>
+            <w:pPr>
+              <w:spacing w:after="0"/>
+            </w:pPr>
+            <w:r>
+              <w:rPr>
+                <w:sz w:val="16"/>
+              </w:rPr>
+              <w:t>Mandantin</w:t>
+            </w:r>
+          </w:p>
+        </w:tc>
+        <w:tc>
+          <w:tcPr>
+            <w:tcW w:type="dxa" w:w="1871"/>
+            <w:tcMar>
+              <w:top w:w="90" w:type="dxa"/>
+              <w:start w:w="90" w:type="dxa"/>
+              <w:bottom w:w="90" w:type="dxa"/>
+              <w:end w:w="90" w:type="dxa"/>
+            </w:tcMar>
+            <w:vAlign w:val="top"/>
+            <w:shd w:fill="F5F7F8"/>
+          </w:tcPr>
+          <w:p>
+            <w:pPr>
+              <w:spacing w:after="0"/>
+            </w:pPr>
+            <w:r>
+              <w:rPr>
+                <w:sz w:val="16"/>
+              </w:rPr>
+              <w:t>10. Juni 2026</w:t>
+            </w:r>
+          </w:p>
+        </w:tc>
+        <w:tc>
+          <w:tcPr>
+            <w:tcW w:type="dxa" w:w="2721"/>
+            <w:tcMar>
+              <w:top w:w="90" w:type="dxa"/>
+              <w:start w:w="90" w:type="dxa"/>
+              <w:bottom w:w="90" w:type="dxa"/>
+              <w:end w:w="90" w:type="dxa"/>
+            </w:tcMar>
+            <w:vAlign w:val="top"/>
+            <w:shd w:fill="F5F7F8"/>
+          </w:tcPr>
+          <w:p>
+            <w:pPr>
+              <w:spacing w:after="0"/>
+            </w:pPr>
+            <w:r>
+              <w:rPr>
+                <w:sz w:val="16"/>
+              </w:rPr>
+              <w:t>Kontaktdaten, Rolle, Beweisthema, Datenexport</w:t>
+            </w:r>
+          </w:p>
+        </w:tc>
+      </w:tr>
+      <w:tr>
+        <w:tc>
+          <w:tcPr>
+            <w:tcW w:type="dxa" w:w="3061"/>
+            <w:tcMar>
+              <w:top w:w="90" w:type="dxa"/>
+              <w:start w:w="90" w:type="dxa"/>
+              <w:bottom w:w="90" w:type="dxa"/>
+              <w:end w:w="90" w:type="dxa"/>
+            </w:tcMar>
+            <w:vAlign w:val="top"/>
+          </w:tcPr>
+          <w:p>
+            <w:pPr>
+              <w:spacing w:after="0"/>
+            </w:pPr>
+            <w:r>
+              <w:rPr>
+                <w:sz w:val="16"/>
+              </w:rPr>
+              <w:t>Wirtschaftliches Ziel und Verhandlungsvollmacht klären</w:t>
+            </w:r>
+          </w:p>
+        </w:tc>
+        <w:tc>
+          <w:tcPr>
+            <w:tcW w:type="dxa" w:w="1814"/>
+            <w:tcMar>
+              <w:top w:w="90" w:type="dxa"/>
+              <w:start w:w="90" w:type="dxa"/>
+              <w:bottom w:w="90" w:type="dxa"/>
+              <w:end w:w="90" w:type="dxa"/>
+            </w:tcMar>
+            <w:vAlign w:val="top"/>
+          </w:tcPr>
+          <w:p>
+            <w:pPr>
+              <w:spacing w:after="0"/>
+            </w:pPr>
+            <w:r>
+              <w:rPr>
+                <w:sz w:val="16"/>
+              </w:rPr>
+              <w:t>Mandantin / Geschäftsführung</w:t>
+            </w:r>
+          </w:p>
+        </w:tc>
+        <w:tc>
+          <w:tcPr>
+            <w:tcW w:type="dxa" w:w="1871"/>
+            <w:tcMar>
+              <w:top w:w="90" w:type="dxa"/>
+              <w:start w:w="90" w:type="dxa"/>
+              <w:bottom w:w="90" w:type="dxa"/>
+              <w:end w:w="90" w:type="dxa"/>
+            </w:tcMar>
+            <w:vAlign w:val="top"/>
+          </w:tcPr>
+          <w:p>
+            <w:pPr>
+              <w:spacing w:after="0"/>
+            </w:pPr>
+            <w:r>
+              <w:rPr>
+                <w:sz w:val="16"/>
+              </w:rPr>
+              <w:t>12. Juni 2026</w:t>
+            </w:r>
+          </w:p>
+        </w:tc>
+        <w:tc>
+          <w:tcPr>
+            <w:tcW w:type="dxa" w:w="2721"/>
+            <w:tcMar>
+              <w:top w:w="90" w:type="dxa"/>
+              <w:start w:w="90" w:type="dxa"/>
+              <w:bottom w:w="90" w:type="dxa"/>
+              <w:end w:w="90" w:type="dxa"/>
+            </w:tcMar>
+            <w:vAlign w:val="top"/>
+          </w:tcPr>
+          <w:p>
+            <w:pPr>
+              <w:spacing w:after="0"/>
+            </w:pPr>
+            <w:r>
+              <w:rPr>
+                <w:sz w:val="16"/>
+              </w:rPr>
+              <w:t>Beschluss oder Gesprächsvermerk</w:t>
+            </w:r>
+          </w:p>
+        </w:tc>
+      </w:tr>
+    </w:tbl>
+    <w:p>
+      <w:pPr>
+        <w:spacing w:after="20"/>
+      </w:pPr>
+    </w:p>
+    <w:p>
+      <w:pPr>
+        <w:pStyle w:val="Heading1"/>
+      </w:pPr>
+      <w:r>
+        <w:t>5. Gesprächsvermerk</w:t>
+      </w:r>
+    </w:p>
+    <w:p>
+      <w:pPr>
+        <w:widowControl/>
+      </w:pPr>
+      <w:r>
+        <w:t>Der Mandant wirkte unter Zeitdruck und konnte die unterschiedlichen Firmennamen in älteren Abrechnungen nicht abschließend erklären. Er bat darum, Frau Anja Altfeld aus der Buchhaltung in die Folgebesprechung einzubeziehen. Keine telefonische Aussage wurde als abschließende Tatsachenbestätigung behandelt.</w:t>
+      </w:r>
+    </w:p>
+    <w:p>
+      <w:pPr>
+        <w:keepLines/>
+        <w:spacing w:before="120"/>
+      </w:pPr>
+      <w:r>
+        <w:rPr>
+          <w:b/>
+        </w:rPr>
+        <w:t>Aufgenommen und diktiert von Stefanie Pollok, Rechtsanwältin</w:t>
       </w:r>
     </w:p>
     <w:sectPr>
+      <w:footerReference w:type="default" r:id="rId9"/>
       <w:pgSz w:w="11906" w:h="16838"/>
-      <w:pgMar w:top="1417" w:right="1417" w:bottom="1417" w:left="1417" w:header="720" w:footer="720" w:gutter="0"/>
+      <w:pgMar w:top="1247" w:right="1134" w:bottom="1020" w:left="1191" w:header="397" w:footer="397" w:gutter="0"/>
       <w:cols w:space="720"/>
       <w:docGrid w:linePitch="360"/>
     </w:sectPr>
   </w:body>
 </w:document>
+</file>
+
+<file path=word/footer1.xml><?xml version="1.0" encoding="utf-8"?>
+<w:ftr xmlns:m="http://schemas.openxmlformats.org/officeDocument/2006/math" xmlns:mc="http://schemas.openxmlformats.org/markup-compatibility/2006" xmlns:mo="http://schemas.microsoft.com/office/mac/office/2008/main" xmlns:mv="urn:schemas-microsoft-com:mac:vml" xmlns:o="urn:schemas-microsoft-com:office:office" xmlns:r="http://schemas.openxmlformats.org/officeDocument/2006/relationships" xmlns:v="urn:schemas-microsoft-com:vml" xmlns:w10="urn:schemas-microsoft-com:office:word" xmlns:w14="http://schemas.microsoft.com/office/word/2010/wordml" xmlns:w="http://schemas.openxmlformats.org/wordprocessingml/2006/main" xmlns:wne="http://schemas.microsoft.com/office/word/2006/wordml" xmlns:wp14="http://schemas.microsoft.com/office/word/2010/wordprocessingDrawing" xmlns:wp="http://schemas.openxmlformats.org/drawingml/2006/wordprocessingDrawing" xmlns:wpc="http://schemas.microsoft.com/office/word/2010/wordprocessingCanvas" xmlns:wpg="http://schemas.microsoft.com/office/word/2010/wordprocessingGroup" xmlns:wpi="http://schemas.microsoft.com/office/word/2010/wordprocessingInk" xmlns:wps="http://schemas.microsoft.com/office/word/2010/wordprocessingShape" mc:Ignorable="w14 wp14">
+  <w:p>
+    <w:pPr>
+      <w:jc w:val="center"/>
+    </w:pPr>
+    <w:r>
+      <w:rPr>
+        <w:color w:val="59636B"/>
+        <w:sz w:val="16"/>
+      </w:rPr>
+      <w:t xml:space="preserve">RHEINBLICK RECHTSANWÄLTE PartG mbB · RB-341/26-HV · Seite </w:t>
+    </w:r>
+    <w:r>
+      <w:fldChar w:fldCharType="begin"/>
+      <w:instrText xml:space="preserve"> PAGE </w:instrText>
+      <w:fldChar w:fldCharType="separate"/>
+      <w:t>1</w:t>
+      <w:fldChar w:fldCharType="end"/>
+    </w:r>
+  </w:p>
+</w:ftr>
 </file>
 
 <file path=word/numbering.xml><?xml version="1.0" encoding="utf-8"?>
@@ -410,9 +2045,13 @@
     <w:name w:val="Normal"/>
     <w:qFormat/>
     <w:rsid w:val="00FC693F"/>
+    <w:pPr>
+      <w:spacing w:after="100" w:line="269" w:lineRule="auto"/>
+    </w:pPr>
     <w:rPr>
-      <w:rFonts w:ascii="Times New Roman" w:hAnsi="Times New Roman"/>
-      <w:sz w:val="22"/>
+      <w:rFonts w:ascii="Arial" w:hAnsi="Arial"/>
+      <w:color w:val="20262B"/>
+      <w:sz w:val="20"/>
     </w:rPr>
   </w:style>
   <w:style w:type="paragraph" w:styleId="Header">
@@ -470,14 +2109,15 @@
     <w:pPr>
       <w:keepNext/>
       <w:keepLines/>
-      <w:spacing w:before="480" w:after="0"/>
+      <w:spacing w:before="200" w:after="100"/>
       <w:outlineLvl w:val="0"/>
     </w:pPr>
     <w:rPr>
-      <w:rFonts w:asciiTheme="majorHAnsi" w:eastAsiaTheme="majorEastAsia" w:hAnsiTheme="majorHAnsi" w:cstheme="majorBidi" w:ascii="Times New Roman" w:hAnsi="Times New Roman"/>
+      <w:rFonts w:asciiTheme="majorHAnsi" w:eastAsiaTheme="majorEastAsia" w:hAnsiTheme="majorHAnsi" w:cstheme="majorBidi" w:ascii="Arial" w:hAnsi="Arial"/>
       <w:b/>
       <w:bCs/>
-      <w:sz w:val="28"/>
+      <w:color w:val="17324D"/>
+      <w:sz w:val="26"/>
       <w:szCs w:val="28"/>
     </w:rPr>
   </w:style>
@@ -493,14 +2133,15 @@
     <w:pPr>
       <w:keepNext/>
       <w:keepLines/>
-      <w:spacing w:before="200" w:after="0"/>
+      <w:spacing w:before="200" w:after="100"/>
       <w:outlineLvl w:val="1"/>
     </w:pPr>
     <w:rPr>
-      <w:rFonts w:asciiTheme="majorHAnsi" w:eastAsiaTheme="majorEastAsia" w:hAnsiTheme="majorHAnsi" w:cstheme="majorBidi" w:ascii="Times New Roman" w:hAnsi="Times New Roman"/>
+      <w:rFonts w:asciiTheme="majorHAnsi" w:eastAsiaTheme="majorEastAsia" w:hAnsiTheme="majorHAnsi" w:cstheme="majorBidi" w:ascii="Arial" w:hAnsi="Arial"/>
       <w:b/>
       <w:bCs/>
-      <w:sz w:val="24"/>
+      <w:color w:val="2E668B"/>
+      <w:sz w:val="22"/>
       <w:szCs w:val="26"/>
     </w:rPr>
   </w:style>
@@ -520,10 +2161,10 @@
       <w:outlineLvl w:val="2"/>
     </w:pPr>
     <w:rPr>
-      <w:rFonts w:asciiTheme="majorHAnsi" w:eastAsiaTheme="majorEastAsia" w:hAnsiTheme="majorHAnsi" w:cstheme="majorBidi" w:ascii="Times New Roman" w:hAnsi="Times New Roman"/>
+      <w:rFonts w:asciiTheme="majorHAnsi" w:eastAsiaTheme="majorEastAsia" w:hAnsiTheme="majorHAnsi" w:cstheme="majorBidi"/>
       <w:b/>
       <w:bCs/>
-      <w:sz w:val="22"/>
+      <w:color w:val="4F81BD" w:themeColor="accent1"/>
     </w:rPr>
   </w:style>
   <w:style w:type="paragraph" w:styleId="Heading4">
@@ -754,18 +2395,20 @@
     <w:qFormat/>
     <w:rsid w:val="00FC693F"/>
     <w:pPr>
+      <w:keepNext/>
       <w:pBdr>
         <w:bottom w:val="single" w:sz="8" w:space="4" w:color="4F81BD" w:themeColor="accent1"/>
       </w:pBdr>
-      <w:spacing w:after="300" w:line="240" w:lineRule="auto"/>
+      <w:spacing w:after="100" w:line="240" w:lineRule="auto" w:before="200"/>
       <w:contextualSpacing/>
     </w:pPr>
     <w:rPr>
-      <w:rFonts w:asciiTheme="majorHAnsi" w:eastAsiaTheme="majorEastAsia" w:hAnsiTheme="majorHAnsi" w:cstheme="majorBidi"/>
-      <w:color w:val="17365D" w:themeColor="text2" w:themeShade="BF"/>
+      <w:rFonts w:asciiTheme="majorHAnsi" w:eastAsiaTheme="majorEastAsia" w:hAnsiTheme="majorHAnsi" w:cstheme="majorBidi" w:ascii="Arial" w:hAnsi="Arial"/>
+      <w:b/>
+      <w:color w:val="17324D"/>
       <w:spacing w:val="5"/>
       <w:kern w:val="28"/>
-      <w:sz w:val="52"/>
+      <w:sz w:val="36"/>
       <w:szCs w:val="52"/>
     </w:rPr>
   </w:style>

</xml_diff>